<commit_message>
Updated the cv documents accordingly
</commit_message>
<xml_diff>
--- a/assets/Alexander_Terentyev_CV.docx
+++ b/assets/Alexander_Terentyev_CV.docx
@@ -45,7 +45,7 @@
         </w:rPr>
       </w:pPr>
       <w:r>
-        <w:t>Junior Software Engineer</w:t>
+        <w:t>Software Engineer</w:t>
       </w:r>
     </w:p>
     <w:p>
@@ -206,19 +206,8 @@
             <w:sz w:val="21"/>
             <w:szCs w:val="21"/>
           </w:rPr>
-          <w:t>linkedin.com/in/</w:t>
+          <w:t>linkedin.com/in/alexanderterentyev</w:t>
         </w:r>
-        <w:proofErr w:type="spellStart"/>
-        <w:r>
-          <w:rPr>
-            <w:rStyle w:val="Hyperlink"/>
-            <w:rFonts w:ascii="Times New Roman" w:hAnsi="Times New Roman" w:cs="Times New Roman"/>
-            <w:sz w:val="21"/>
-            <w:szCs w:val="21"/>
-          </w:rPr>
-          <w:t>alexanderterentyev</w:t>
-        </w:r>
-        <w:proofErr w:type="spellEnd"/>
       </w:hyperlink>
     </w:p>
     <w:p>
@@ -328,16 +317,8 @@
         <w:rPr>
           <w:rStyle w:val="Strong"/>
         </w:rPr>
-        <w:t xml:space="preserve">Tron </w:t>
-      </w:r>
-      <w:proofErr w:type="spellStart"/>
-      <w:r>
-        <w:rPr>
-          <w:rStyle w:val="Strong"/>
-        </w:rPr>
-        <w:t>BattleTanks</w:t>
-      </w:r>
-      <w:proofErr w:type="spellEnd"/>
+        <w:t>Tron BattleTanks</w:t>
+      </w:r>
       <w:r>
         <w:t>,</w:t>
       </w:r>
@@ -352,30 +333,8 @@
           <w:rPr>
             <w:rStyle w:val="Hyperlink"/>
           </w:rPr>
-          <w:t>github.com/</w:t>
+          <w:t>github.com/BeHaVeZ/FMLEngine-Tron_BattleTanks</w:t>
         </w:r>
-        <w:proofErr w:type="spellStart"/>
-        <w:r>
-          <w:rPr>
-            <w:rStyle w:val="Hyperlink"/>
-          </w:rPr>
-          <w:t>BeHaVeZ</w:t>
-        </w:r>
-        <w:proofErr w:type="spellEnd"/>
-        <w:r>
-          <w:rPr>
-            <w:rStyle w:val="Hyperlink"/>
-          </w:rPr>
-          <w:t>/</w:t>
-        </w:r>
-        <w:proofErr w:type="spellStart"/>
-        <w:r>
-          <w:rPr>
-            <w:rStyle w:val="Hyperlink"/>
-          </w:rPr>
-          <w:t>FMLEngine-Tron_BattleTanks</w:t>
-        </w:r>
-        <w:proofErr w:type="spellEnd"/>
       </w:hyperlink>
       <w:r>
         <w:t>)</w:t>
@@ -435,15 +394,7 @@
         </w:rPr>
       </w:pPr>
       <w:r>
-        <w:t xml:space="preserve">Implemented scene/state management (menu, gameplay, </w:t>
-      </w:r>
-      <w:proofErr w:type="spellStart"/>
-      <w:r>
-        <w:t>highscores</w:t>
-      </w:r>
-      <w:proofErr w:type="spellEnd"/>
-      <w:r>
-        <w:t>) with clean transitions and lifecycle handling.</w:t>
+        <w:t>Implemented scene/state management (menu, gameplay, highscores) with clean transitions and lifecycle handling.</w:t>
       </w:r>
     </w:p>
     <w:p>
@@ -479,15 +430,7 @@
         </w:rPr>
       </w:pPr>
       <w:r>
-        <w:t xml:space="preserve">Implemented enemy tank movement using </w:t>
-      </w:r>
-      <w:proofErr w:type="spellStart"/>
-      <w:r>
-        <w:t>raycasts</w:t>
-      </w:r>
-      <w:proofErr w:type="spellEnd"/>
-      <w:r>
-        <w:t xml:space="preserve"> for wall detection and validated turns using corner probes.</w:t>
+        <w:t>Implemented enemy tank movement using raycasts for wall detection and validated turns using corner probes.</w:t>
       </w:r>
     </w:p>
     <w:p>
@@ -505,15 +448,7 @@
         </w:rPr>
       </w:pPr>
       <w:r>
-        <w:t xml:space="preserve">Implemented </w:t>
-      </w:r>
-      <w:proofErr w:type="spellStart"/>
-      <w:r>
-        <w:t>highscore</w:t>
-      </w:r>
-      <w:proofErr w:type="spellEnd"/>
-      <w:r>
-        <w:t xml:space="preserve"> persistence (file IO) and a name-entry flow for score submission.</w:t>
+        <w:t>Implemented highscore persistence (file IO) and a name-entry flow for score submission.</w:t>
       </w:r>
     </w:p>
     <w:p>
@@ -964,15 +899,7 @@
         <w:t>Engineer</w:t>
       </w:r>
       <w:r>
-        <w:t xml:space="preserve">, </w:t>
-      </w:r>
-      <w:proofErr w:type="spellStart"/>
-      <w:r>
-        <w:t>AlterEyes</w:t>
-      </w:r>
-      <w:proofErr w:type="spellEnd"/>
-      <w:r>
-        <w:t xml:space="preserve">, Hasselt, Belgium | Sep 2025 – </w:t>
+        <w:t xml:space="preserve">, AlterEyes, Hasselt, Belgium | Sep 2025 – </w:t>
       </w:r>
       <w:r>
         <w:t>Present</w:t>
@@ -1111,15 +1038,7 @@
         <w:t>Software Developer Intern</w:t>
       </w:r>
       <w:r>
-        <w:t xml:space="preserve">, </w:t>
-      </w:r>
-      <w:proofErr w:type="spellStart"/>
-      <w:r>
-        <w:t>AlterEyes</w:t>
-      </w:r>
-      <w:proofErr w:type="spellEnd"/>
-      <w:r>
-        <w:t>, Hasselt, Belgium | Sep 2025 – Jan 2026</w:t>
+        <w:t>, AlterEyes, Hasselt, Belgium | Sep 2025 – Jan 2026</w:t>
       </w:r>
     </w:p>
     <w:p>
@@ -1178,7 +1097,6 @@
       <w:r>
         <w:t xml:space="preserve">Collaborated through </w:t>
       </w:r>
-      <w:proofErr w:type="spellStart"/>
       <w:r>
         <w:rPr>
           <w:rStyle w:val="Strong"/>
@@ -1187,7 +1105,6 @@
         </w:rPr>
         <w:t>Gitea</w:t>
       </w:r>
-      <w:proofErr w:type="spellEnd"/>
       <w:r>
         <w:rPr>
           <w:rStyle w:val="Strong"/>
@@ -1195,15 +1112,7 @@
         <w:t xml:space="preserve"> </w:t>
       </w:r>
       <w:r>
-        <w:t xml:space="preserve">with structured branching and code reviews; communicated progress and </w:t>
-      </w:r>
-      <w:proofErr w:type="spellStart"/>
-      <w:r>
-        <w:t>tradeoffs</w:t>
-      </w:r>
-      <w:proofErr w:type="spellEnd"/>
-      <w:r>
-        <w:t xml:space="preserve"> using</w:t>
+        <w:t>with structured branching and code reviews; communicated progress and tradeoffs using</w:t>
       </w:r>
       <w:r>
         <w:rPr>
@@ -1211,7 +1120,6 @@
         </w:rPr>
         <w:t xml:space="preserve"> </w:t>
       </w:r>
-      <w:proofErr w:type="spellStart"/>
       <w:r>
         <w:rPr>
           <w:rStyle w:val="Strong"/>
@@ -1220,17 +1128,8 @@
         </w:rPr>
         <w:t>YouTrack</w:t>
       </w:r>
-      <w:proofErr w:type="spellEnd"/>
-      <w:r>
-        <w:t xml:space="preserve"> following the </w:t>
-      </w:r>
-      <w:proofErr w:type="gramStart"/>
-      <w:r>
-        <w:t>companies</w:t>
-      </w:r>
-      <w:proofErr w:type="gramEnd"/>
-      <w:r>
-        <w:t xml:space="preserve"> workflow.</w:t>
+      <w:r>
+        <w:t xml:space="preserve"> following the companies workflow.</w:t>
       </w:r>
     </w:p>
     <w:p>
@@ -1567,7 +1466,6 @@
           <w:szCs w:val="28"/>
         </w:rPr>
       </w:pPr>
-      <w:proofErr w:type="gramStart"/>
       <w:r>
         <w:rPr>
           <w:rFonts w:ascii="Calibri" w:hAnsi="Calibri" w:cs="Calibri"/>
@@ -1577,7 +1475,6 @@
         </w:rPr>
         <w:t>Bachelor Degree</w:t>
       </w:r>
-      <w:proofErr w:type="gramEnd"/>
       <w:r>
         <w:rPr>
           <w:rFonts w:ascii="Calibri" w:hAnsi="Calibri" w:cs="Calibri"/>
@@ -1666,7 +1563,6 @@
           <w:szCs w:val="28"/>
         </w:rPr>
       </w:pPr>
-      <w:proofErr w:type="gramStart"/>
       <w:r>
         <w:rPr>
           <w:rFonts w:ascii="Calibri" w:hAnsi="Calibri" w:cs="Calibri"/>
@@ -1676,7 +1572,6 @@
         </w:rPr>
         <w:t>Associate Degree</w:t>
       </w:r>
-      <w:proofErr w:type="gramEnd"/>
       <w:r>
         <w:rPr>
           <w:rFonts w:ascii="Calibri" w:hAnsi="Calibri" w:cs="Calibri"/>
@@ -1704,7 +1599,6 @@
         </w:rPr>
         <w:t xml:space="preserve">, </w:t>
       </w:r>
-      <w:proofErr w:type="spellStart"/>
       <w:r>
         <w:rPr>
           <w:rFonts w:ascii="Calibri" w:hAnsi="Calibri" w:cs="Calibri"/>
@@ -1712,29 +1606,8 @@
           <w:sz w:val="24"/>
           <w:szCs w:val="28"/>
         </w:rPr>
-        <w:t>Artesis</w:t>
-      </w:r>
-      <w:proofErr w:type="spellEnd"/>
-      <w:r>
-        <w:rPr>
-          <w:rFonts w:ascii="Calibri" w:hAnsi="Calibri" w:cs="Calibri"/>
-          <w:bCs/>
-          <w:sz w:val="24"/>
-          <w:szCs w:val="28"/>
-        </w:rPr>
-        <w:t xml:space="preserve"> </w:t>
-      </w:r>
-      <w:proofErr w:type="spellStart"/>
-      <w:r>
-        <w:rPr>
-          <w:rFonts w:ascii="Calibri" w:hAnsi="Calibri" w:cs="Calibri"/>
-          <w:bCs/>
-          <w:sz w:val="24"/>
-          <w:szCs w:val="28"/>
-        </w:rPr>
-        <w:t>Plantijn</w:t>
-      </w:r>
-      <w:proofErr w:type="spellEnd"/>
+        <w:t>Artesis Plantijn</w:t>
+      </w:r>
       <w:r>
         <w:rPr>
           <w:rFonts w:ascii="Calibri" w:hAnsi="Calibri" w:cs="Calibri"/>
@@ -1943,21 +1816,12 @@
         </w:rPr>
         <w:t xml:space="preserve"> </w:t>
       </w:r>
-      <w:proofErr w:type="spellStart"/>
-      <w:r>
-        <w:rPr>
-          <w:rFonts w:cstheme="minorHAnsi"/>
-          <w:szCs w:val="28"/>
-        </w:rPr>
-        <w:t>YouTrack</w:t>
-      </w:r>
-      <w:proofErr w:type="spellEnd"/>
-      <w:r>
-        <w:rPr>
-          <w:rFonts w:cstheme="minorHAnsi"/>
-          <w:szCs w:val="28"/>
-        </w:rPr>
-        <w:t xml:space="preserve"> </w:t>
+      <w:r>
+        <w:rPr>
+          <w:rFonts w:cstheme="minorHAnsi"/>
+          <w:szCs w:val="28"/>
+        </w:rPr>
+        <w:t xml:space="preserve">YouTrack </w:t>
       </w:r>
       <w:r>
         <w:rPr>
@@ -1973,7 +1837,6 @@
         </w:rPr>
         <w:t xml:space="preserve"> </w:t>
       </w:r>
-      <w:proofErr w:type="spellStart"/>
       <w:r>
         <w:rPr>
           <w:rFonts w:cstheme="minorHAnsi"/>
@@ -1988,7 +1851,6 @@
         </w:rPr>
         <w:t>ea</w:t>
       </w:r>
-      <w:proofErr w:type="spellEnd"/>
       <w:r>
         <w:rPr>
           <w:rFonts w:cstheme="minorHAnsi"/>
@@ -2010,7 +1872,6 @@
         </w:rPr>
         <w:t xml:space="preserve"> </w:t>
       </w:r>
-      <w:proofErr w:type="spellStart"/>
       <w:r>
         <w:rPr>
           <w:rFonts w:cstheme="minorHAnsi"/>
@@ -2018,7 +1879,6 @@
         </w:rPr>
         <w:t>CMake</w:t>
       </w:r>
-      <w:proofErr w:type="spellEnd"/>
       <w:r>
         <w:rPr>
           <w:rFonts w:cstheme="minorHAnsi"/>
@@ -2883,6 +2743,7 @@
   <w:style w:type="character" w:default="1" w:styleId="DefaultParagraphFont">
     <w:name w:val="Default Paragraph Font"/>
     <w:uiPriority w:val="1"/>
+    <w:semiHidden/>
     <w:unhideWhenUsed/>
   </w:style>
   <w:style w:type="table" w:default="1" w:styleId="TableNormal">

</xml_diff>